<commit_message>
docs(pz09): add verified auth scenario screenshot
</commit_message>
<xml_diff>
--- a/reports/word/pz09.docx
+++ b/reports/word/pz09.docx
@@ -1039,18 +1039,73 @@
       </w:r>
     </w:p>
     <w:p>
-      <w:pPr/>
+      <w:pPr>
+        <w:keepNext/>
+      </w:pPr>
       <w:r>
-        <w:t xml:space="preserve">Исходное задание требует скриншоты успешной и повторной регистрации, верного и неверного входа. Пока сохранён реальный текстовый лог; </w:t>
+        <w:t xml:space="preserve">Исходное задание требует скриншоты успешной и повторной регистрации, верного и неверного входа. Один подлинный снимок локального запуска показывает все четыре ответа (201, 409, 200, 401), проверку миграции и строку </w:t>
       </w:r>
       <w:r>
         <w:rPr>
-          <w:b/>
+          <w:rFonts w:ascii="Consolas" w:hAnsi="Consolas"/>
+          <w:sz w:val="18"/>
         </w:rPr>
-        <w:t>скриншоты нужно снять с вывода run-local.ps1 и добавить в reports/images/pz09/</w:t>
+        <w:t>PZ09 scenario passed.</w:t>
       </w:r>
       <w:r>
-        <w:t>. До их добавления этот пункт отчёта не закрыт.</w:t>
+        <w:t>. Пароль PostgreSQL, тестовый пароль, DSN и хэш на нём не показаны. Это отдельный запуск на машине пользователя; поэтому случайный email и порт отличаются от текстового лога выше.</w:t>
+      </w:r>
+    </w:p>
+    <w:p>
+      <w:pPr>
+        <w:spacing w:before="100" w:after="60"/>
+        <w:jc w:val="center"/>
+      </w:pPr>
+      <w:r>
+        <w:drawing>
+          <wp:inline xmlns:a="http://schemas.openxmlformats.org/drawingml/2006/main" xmlns:pic="http://schemas.openxmlformats.org/drawingml/2006/picture">
+            <wp:extent cx="6192000" cy="1628252"/>
+            <wp:docPr id="1" name="Picture 1"/>
+            <wp:cNvGraphicFramePr>
+              <a:graphicFrameLocks noChangeAspect="1"/>
+            </wp:cNvGraphicFramePr>
+            <a:graphic>
+              <a:graphicData uri="http://schemas.openxmlformats.org/drawingml/2006/picture">
+                <pic:pic>
+                  <pic:nvPicPr>
+                    <pic:cNvPr id="0" name="auth-scenario.png"/>
+                    <pic:cNvPicPr/>
+                  </pic:nvPicPr>
+                  <pic:blipFill>
+                    <a:blip r:embed="rId12"/>
+                    <a:stretch>
+                      <a:fillRect/>
+                    </a:stretch>
+                  </pic:blipFill>
+                  <pic:spPr>
+                    <a:xfrm>
+                      <a:off x="0" y="0"/>
+                      <a:ext cx="6192000" cy="1628252"/>
+                    </a:xfrm>
+                    <a:prstGeom prst="rect"/>
+                  </pic:spPr>
+                </pic:pic>
+              </a:graphicData>
+            </a:graphic>
+          </wp:inline>
+        </w:drawing>
+      </w:r>
+    </w:p>
+    <w:p>
+      <w:pPr>
+        <w:spacing w:after="160"/>
+        <w:jc w:val="center"/>
+      </w:pPr>
+      <w:r>
+        <w:rPr>
+          <w:sz w:val="17"/>
+        </w:rPr>
+        <w:t>Успешная и повторная регистрация, верный и неверный вход</w:t>
       </w:r>
     </w:p>
     <w:p>
@@ -1187,7 +1242,7 @@
         <w:t>HttpClient</w:t>
       </w:r>
       <w:r>
-        <w:t xml:space="preserve"> и повторно выполнен. Получены все четыре основных статуса, миграция и bcrypt-хранение подтверждены. Для окончательного оформления остаются настоящие скриншоты.</w:t>
+        <w:t xml:space="preserve"> и повторно выполнен. Получены все четыре основных статуса, миграция и bcrypt-хранение подтверждены текстовым логом и настоящим скриншотом.</w:t>
       </w:r>
     </w:p>
     <w:p>
@@ -1195,7 +1250,7 @@
       <w:r>
         <w:t xml:space="preserve">Код: </w:t>
       </w:r>
-      <w:hyperlink r:id="rId12">
+      <w:hyperlink r:id="rId13">
         <w:r>
           <w:rPr>
             <w:color w:val="195A85"/>
@@ -1206,7 +1261,7 @@
       <w:r>
         <w:t xml:space="preserve">. Репозиторий: </w:t>
       </w:r>
-      <w:hyperlink r:id="rId13">
+      <w:hyperlink r:id="rId14">
         <w:r>
           <w:rPr>
             <w:color w:val="195A85"/>
@@ -1592,13 +1647,13 @@
     <w:qFormat/>
     <w:rsid w:val="00FC693F"/>
     <w:pPr>
-      <w:spacing w:after="120" w:line="269" w:lineRule="auto"/>
+      <w:spacing w:after="80" w:line="252" w:lineRule="auto"/>
     </w:pPr>
     <w:rPr>
       <w:rFonts w:ascii="Calibri" w:hAnsi="Calibri" w:eastAsia="Calibri" w:cs="Calibri"/>
       <w:b w:val="0"/>
       <w:color w:val="000000"/>
-      <w:sz w:val="21"/>
+      <w:sz w:val="20"/>
     </w:rPr>
   </w:style>
   <w:style w:type="paragraph" w:styleId="Header">

</xml_diff>

<commit_message>
docs(pz09): clarify auth flow and Word layout
</commit_message>
<xml_diff>
--- a/reports/word/pz09.docx
+++ b/reports/word/pz09.docx
@@ -366,28 +366,36 @@
     <w:p>
       <w:pPr>
         <w:pStyle w:val="Code"/>
-        <w:keepNext/>
+        <w:keepNext w:val="0"/>
       </w:pPr>
       <w:r>
         <w:t>hash, err := bcrypt.GenerateFromPassword([]byte(in.Password), h.BcryptCost)</w:t>
       </w:r>
     </w:p>
     <w:p>
-      <w:pPr>
-        <w:pStyle w:val="Code"/>
-        <w:keepNext/>
-      </w:pPr>
+      <w:pPr/>
       <w:r>
-        <w:t>user := core.User{Email: in.Email, PasswordHash: string(hash)}</w:t>
+        <w:t xml:space="preserve">После проверки ошибки хэш сохраняется в </w:t>
       </w:r>
-    </w:p>
-    <w:p>
-      <w:pPr>
-        <w:pStyle w:val="Code"/>
-        <w:keepNext w:val="0"/>
-      </w:pPr>
       <w:r>
-        <w:t>err = h.Users.Create(r.Context(), &amp;user)</w:t>
+        <w:rPr>
+          <w:rFonts w:ascii="Consolas" w:hAnsi="Consolas"/>
+          <w:sz w:val="18"/>
+        </w:rPr>
+        <w:t>core.User.PasswordHash</w:t>
+      </w:r>
+      <w:r>
+        <w:t xml:space="preserve">; </w:t>
+      </w:r>
+      <w:r>
+        <w:rPr>
+          <w:rFonts w:ascii="Consolas" w:hAnsi="Consolas"/>
+          <w:sz w:val="18"/>
+        </w:rPr>
+        <w:t>ErrEmailTaken</w:t>
+      </w:r>
+      <w:r>
+        <w:t xml:space="preserve"> переводится в 409, а прочие ошибки БД — в 500.</w:t>
       </w:r>
     </w:p>
     <w:p>
@@ -402,7 +410,7 @@
         <w:t>Login</w:t>
       </w:r>
       <w:r>
-        <w:t xml:space="preserve"> ищет пользователя по нормализованному email и сравнивает пароль со встроенной солью хэша. Для неверного пароля и неизвестного email возвращает один ответ </w:t>
+        <w:t xml:space="preserve"> ищет пользователя по нормализованному email и проверяет ошибку поиска: неизвестный email даёт 401, ошибка БД — 500. Затем пароль сравнивается со встроенной солью хэша. Для неверного пароля и неизвестного email возвращается один ответ </w:t>
       </w:r>
       <w:r>
         <w:rPr>
@@ -413,15 +421,6 @@
       </w:r>
       <w:r>
         <w:t>:</w:t>
-      </w:r>
-    </w:p>
-    <w:p>
-      <w:pPr>
-        <w:pStyle w:val="Code"/>
-        <w:keepNext/>
-      </w:pPr>
-      <w:r>
-        <w:t>user, err := h.Users.ByEmail(r.Context(), in.Email)</w:t>
       </w:r>
     </w:p>
     <w:p>
@@ -1147,7 +1146,7 @@
         <w:t>Почему bcrypt, а не SHA-256; что делает cost?</w:t>
       </w:r>
       <w:r>
-        <w:t xml:space="preserve"> SHA-256 рассчитан на быстрое вычисление, что облегчает массовый подбор. bcrypt медленный, содержит соль и настраиваемую стоимость. Повышение cost замедляет и легитимный вход, и перебор; снижение ускоряет оба. Значение подбирают по времени на целевой машине; в этой работе по заданию использовано 12. Тесты используют минимальную стоимость ради скорости, не для реального сервиса.</w:t>
+        <w:t xml:space="preserve"> SHA-256 рассчитан на быстрое вычисление, что облегчает массовый подбор. bcrypt медленный, содержит соль и настраиваемую стоимость. Повышение cost замедляет и легитимный вход, и перебор; снижение ускоряет оба. Значение подбирают по времени на целевой машине; в этой работе по заданию использовано 12 (см. лекцию 1.5 курса). Тесты используют минимальную стоимость ради скорости, не для реального сервиса.</w:t>
       </w:r>
     </w:p>
     <w:p>
@@ -1243,34 +1242,6 @@
       </w:r>
       <w:r>
         <w:t xml:space="preserve"> и повторно выполнен. Получены все четыре основных статуса, миграция и bcrypt-хранение подтверждены текстовым логом и настоящим скриншотом.</w:t>
-      </w:r>
-    </w:p>
-    <w:p>
-      <w:pPr/>
-      <w:r>
-        <w:t xml:space="preserve">Код: </w:t>
-      </w:r>
-      <w:hyperlink r:id="rId13">
-        <w:r>
-          <w:rPr>
-            <w:color w:val="195A85"/>
-          </w:rPr>
-          <w:t>practices/pz09-auth</w:t>
-        </w:r>
-      </w:hyperlink>
-      <w:r>
-        <w:t xml:space="preserve">. Репозиторий: </w:t>
-      </w:r>
-      <w:hyperlink r:id="rId14">
-        <w:r>
-          <w:rPr>
-            <w:color w:val="195A85"/>
-          </w:rPr>
-          <w:t>Pondaaaaaa/GO</w:t>
-        </w:r>
-      </w:hyperlink>
-      <w:r>
-        <w:t>.</w:t>
       </w:r>
     </w:p>
     <w:sectPr>

</xml_diff>